<commit_message>
Little reorganization and added project related files and docs for Spring 2022 - Pratik
</commit_message>
<xml_diff>
--- a/spring-2022/Timeline.docx
+++ b/spring-2022/Timeline.docx
@@ -244,6 +244,24 @@
     <w:p>
       <w:pPr>
         <w:numPr>
+          <w:ilvl w:val="2"/>
+          <w:numId w:val="1"/>
+        </w:numPr>
+        <w:ind w:left="2160" w:hanging="360"/>
+        <w:rPr>
+          <w:u w:val="none"/>
+        </w:rPr>
+      </w:pPr>
+      <w:r>
+        <w:rPr>
+          <w:rtl w:val="0"/>
+        </w:rPr>
+        <w:t xml:space="preserve">Decided metrics - work on the model</w:t>
+      </w:r>
+    </w:p>
+    <w:p>
+      <w:pPr>
+        <w:numPr>
           <w:ilvl w:val="1"/>
           <w:numId w:val="1"/>
         </w:numPr>
@@ -292,6 +310,24 @@
     <w:p>
       <w:pPr>
         <w:numPr>
+          <w:ilvl w:val="2"/>
+          <w:numId w:val="1"/>
+        </w:numPr>
+        <w:ind w:left="2160" w:hanging="360"/>
+        <w:rPr>
+          <w:u w:val="none"/>
+        </w:rPr>
+      </w:pPr>
+      <w:r>
+        <w:rPr>
+          <w:rtl w:val="0"/>
+        </w:rPr>
+        <w:t xml:space="preserve">Working on how we connect the concept of topic modeling to our research, eg, Latent Dirichlet Allocation.</w:t>
+      </w:r>
+    </w:p>
+    <w:p>
+      <w:pPr>
+        <w:numPr>
           <w:ilvl w:val="0"/>
           <w:numId w:val="1"/>
         </w:numPr>
@@ -355,6 +391,24 @@
     <w:p>
       <w:pPr>
         <w:numPr>
+          <w:ilvl w:val="2"/>
+          <w:numId w:val="1"/>
+        </w:numPr>
+        <w:ind w:left="2160" w:hanging="360"/>
+        <w:rPr>
+          <w:u w:val="none"/>
+        </w:rPr>
+      </w:pPr>
+      <w:r>
+        <w:rPr>
+          <w:rtl w:val="0"/>
+        </w:rPr>
+        <w:t xml:space="preserve">Got data access, met with Malav and Gautam to learn about metrics, still coordinating with PARQR team</w:t>
+      </w:r>
+    </w:p>
+    <w:p>
+      <w:pPr>
+        <w:numPr>
           <w:ilvl w:val="1"/>
           <w:numId w:val="1"/>
         </w:numPr>
@@ -406,6 +460,24 @@
     <w:p>
       <w:pPr>
         <w:numPr>
+          <w:ilvl w:val="2"/>
+          <w:numId w:val="1"/>
+        </w:numPr>
+        <w:ind w:left="2160" w:hanging="360"/>
+        <w:rPr>
+          <w:u w:val="none"/>
+        </w:rPr>
+      </w:pPr>
+      <w:r>
+        <w:rPr>
+          <w:rtl w:val="0"/>
+        </w:rPr>
+        <w:t xml:space="preserve">Connected with Sambhav for front-end and clarified next steps, working on  data access</w:t>
+      </w:r>
+    </w:p>
+    <w:p>
+      <w:pPr>
+        <w:numPr>
           <w:ilvl w:val="1"/>
           <w:numId w:val="1"/>
         </w:numPr>
@@ -433,6 +505,24 @@
         <w:rPr>
           <w:rtl w:val="0"/>
         </w:rPr>
+        <w:t xml:space="preserve">Working on Piazza API and mapping to database</w:t>
+      </w:r>
+    </w:p>
+    <w:p>
+      <w:pPr>
+        <w:numPr>
+          <w:ilvl w:val="2"/>
+          <w:numId w:val="1"/>
+        </w:numPr>
+        <w:ind w:left="2160" w:hanging="360"/>
+        <w:rPr>
+          <w:u w:val="none"/>
+        </w:rPr>
+      </w:pPr>
+      <w:r>
+        <w:rPr>
+          <w:rtl w:val="0"/>
+        </w:rPr>
         <w:t xml:space="preserve">Understanding prev code, SQL connection with Python, look at Piazza API</w:t>
       </w:r>
     </w:p>
@@ -505,17 +595,384 @@
         <w:rPr>
           <w:rtl w:val="0"/>
         </w:rPr>
-      </w:r>
-    </w:p>
-    <w:p>
-      <w:pPr>
-        <w:ind w:left="1440" w:firstLine="0"/>
+        <w:t xml:space="preserve">Meeting with Partik and Meryem - detect metacognition within discussion forum and find relationship</w:t>
+      </w:r>
+    </w:p>
+    <w:p>
+      <w:pPr>
         <w:rPr/>
       </w:pPr>
       <w:r>
         <w:rPr>
           <w:rtl w:val="0"/>
         </w:rPr>
+        <w:t xml:space="preserve">February 17th (2 weeks)</w:t>
+      </w:r>
+    </w:p>
+    <w:p>
+      <w:pPr>
+        <w:numPr>
+          <w:ilvl w:val="0"/>
+          <w:numId w:val="1"/>
+        </w:numPr>
+        <w:ind w:left="720" w:hanging="360"/>
+      </w:pPr>
+      <w:r>
+        <w:rPr>
+          <w:rtl w:val="0"/>
+        </w:rPr>
+        <w:t xml:space="preserve">Project Management</w:t>
+      </w:r>
+    </w:p>
+    <w:p>
+      <w:pPr>
+        <w:numPr>
+          <w:ilvl w:val="1"/>
+          <w:numId w:val="1"/>
+        </w:numPr>
+        <w:ind w:left="1440" w:hanging="360"/>
+      </w:pPr>
+      <w:r>
+        <w:rPr>
+          <w:rtl w:val="0"/>
+        </w:rPr>
+        <w:t xml:space="preserve">Pratik:</w:t>
+      </w:r>
+    </w:p>
+    <w:p>
+      <w:pPr>
+        <w:numPr>
+          <w:ilvl w:val="2"/>
+          <w:numId w:val="1"/>
+        </w:numPr>
+        <w:ind w:left="2160" w:hanging="360"/>
+      </w:pPr>
+      <w:r>
+        <w:rPr>
+          <w:rtl w:val="0"/>
+        </w:rPr>
+        <w:t xml:space="preserve">Backward design for identifying specific tasks for team members</w:t>
+      </w:r>
+    </w:p>
+    <w:p>
+      <w:pPr>
+        <w:numPr>
+          <w:ilvl w:val="2"/>
+          <w:numId w:val="1"/>
+        </w:numPr>
+        <w:ind w:left="2160" w:hanging="360"/>
+      </w:pPr>
+      <w:r>
+        <w:rPr>
+          <w:rtl w:val="0"/>
+        </w:rPr>
+        <w:t xml:space="preserve">Update t-shirt design in 2 weeks (applies to everyone)</w:t>
+      </w:r>
+    </w:p>
+    <w:p>
+      <w:pPr>
+        <w:numPr>
+          <w:ilvl w:val="3"/>
+          <w:numId w:val="1"/>
+        </w:numPr>
+        <w:ind w:left="2880" w:hanging="360"/>
+      </w:pPr>
+      <w:r>
+        <w:rPr>
+          <w:rtl w:val="0"/>
+        </w:rPr>
+        <w:t xml:space="preserve">Work with Harriet (Monday 11 am ET?)</w:t>
+      </w:r>
+    </w:p>
+    <w:p>
+      <w:pPr>
+        <w:numPr>
+          <w:ilvl w:val="0"/>
+          <w:numId w:val="1"/>
+        </w:numPr>
+        <w:ind w:left="720" w:hanging="360"/>
+      </w:pPr>
+      <w:r>
+        <w:rPr>
+          <w:rtl w:val="0"/>
+        </w:rPr>
+        <w:t xml:space="preserve">Data science</w:t>
+      </w:r>
+    </w:p>
+    <w:p>
+      <w:pPr>
+        <w:numPr>
+          <w:ilvl w:val="1"/>
+          <w:numId w:val="1"/>
+        </w:numPr>
+        <w:ind w:left="1440" w:hanging="360"/>
+      </w:pPr>
+      <w:r>
+        <w:rPr>
+          <w:rtl w:val="0"/>
+        </w:rPr>
+        <w:t xml:space="preserve">Nidhi:</w:t>
+      </w:r>
+    </w:p>
+    <w:p>
+      <w:pPr>
+        <w:numPr>
+          <w:ilvl w:val="2"/>
+          <w:numId w:val="1"/>
+        </w:numPr>
+        <w:ind w:left="2160" w:hanging="360"/>
+      </w:pPr>
+      <w:r>
+        <w:rPr>
+          <w:rtl w:val="0"/>
+        </w:rPr>
+        <w:t xml:space="preserve">Label data from AI course - group questions together by topic</w:t>
+      </w:r>
+    </w:p>
+    <w:p>
+      <w:pPr>
+        <w:numPr>
+          <w:ilvl w:val="1"/>
+          <w:numId w:val="1"/>
+        </w:numPr>
+        <w:ind w:left="1440" w:hanging="360"/>
+      </w:pPr>
+      <w:r>
+        <w:rPr>
+          <w:rtl w:val="0"/>
+        </w:rPr>
+        <w:t xml:space="preserve">Malav:</w:t>
+      </w:r>
+    </w:p>
+    <w:p>
+      <w:pPr>
+        <w:numPr>
+          <w:ilvl w:val="2"/>
+          <w:numId w:val="1"/>
+        </w:numPr>
+        <w:ind w:left="2160" w:hanging="360"/>
+      </w:pPr>
+      <w:r>
+        <w:rPr>
+          <w:rtl w:val="0"/>
+        </w:rPr>
+        <w:t xml:space="preserve">Topic modeling - LDA &amp; NMF - Segregating QnA</w:t>
+      </w:r>
+    </w:p>
+    <w:p>
+      <w:pPr>
+        <w:numPr>
+          <w:ilvl w:val="1"/>
+          <w:numId w:val="1"/>
+        </w:numPr>
+        <w:ind w:left="1440" w:hanging="360"/>
+      </w:pPr>
+      <w:r>
+        <w:rPr>
+          <w:rtl w:val="0"/>
+        </w:rPr>
+        <w:t xml:space="preserve">Jisan Park:</w:t>
+      </w:r>
+    </w:p>
+    <w:p>
+      <w:pPr>
+        <w:numPr>
+          <w:ilvl w:val="2"/>
+          <w:numId w:val="1"/>
+        </w:numPr>
+        <w:ind w:left="2160" w:hanging="360"/>
+      </w:pPr>
+      <w:r>
+        <w:rPr>
+          <w:rtl w:val="0"/>
+        </w:rPr>
+        <w:t xml:space="preserve">Replicate the medium article on quora question similarity</w:t>
+      </w:r>
+    </w:p>
+    <w:p>
+      <w:pPr>
+        <w:numPr>
+          <w:ilvl w:val="0"/>
+          <w:numId w:val="1"/>
+        </w:numPr>
+        <w:ind w:left="720" w:hanging="360"/>
+      </w:pPr>
+      <w:r>
+        <w:rPr>
+          <w:rtl w:val="0"/>
+        </w:rPr>
+        <w:t xml:space="preserve">Web development</w:t>
+      </w:r>
+    </w:p>
+    <w:p>
+      <w:pPr>
+        <w:numPr>
+          <w:ilvl w:val="1"/>
+          <w:numId w:val="1"/>
+        </w:numPr>
+        <w:ind w:left="1440" w:hanging="360"/>
+      </w:pPr>
+      <w:r>
+        <w:rPr>
+          <w:rtl w:val="0"/>
+        </w:rPr>
+        <w:t xml:space="preserve">Aanya:</w:t>
+      </w:r>
+    </w:p>
+    <w:p>
+      <w:pPr>
+        <w:numPr>
+          <w:ilvl w:val="2"/>
+          <w:numId w:val="1"/>
+        </w:numPr>
+        <w:ind w:left="2160" w:hanging="360"/>
+      </w:pPr>
+      <w:r>
+        <w:rPr>
+          <w:rtl w:val="0"/>
+        </w:rPr>
+        <w:t xml:space="preserve">Email Dr. Lee cc - Dr. Meryem to connect with PARQR team for script/guidance etc</w:t>
+      </w:r>
+    </w:p>
+    <w:p>
+      <w:pPr>
+        <w:numPr>
+          <w:ilvl w:val="2"/>
+          <w:numId w:val="1"/>
+        </w:numPr>
+        <w:ind w:left="2160" w:hanging="360"/>
+        <w:rPr>
+          <w:u w:val="none"/>
+        </w:rPr>
+      </w:pPr>
+      <w:r>
+        <w:rPr>
+          <w:rtl w:val="0"/>
+        </w:rPr>
+        <w:t xml:space="preserve">Prepare the rest of the pipeline</w:t>
+      </w:r>
+    </w:p>
+    <w:p>
+      <w:pPr>
+        <w:numPr>
+          <w:ilvl w:val="1"/>
+          <w:numId w:val="1"/>
+        </w:numPr>
+        <w:ind w:left="1440" w:hanging="360"/>
+      </w:pPr>
+      <w:r>
+        <w:rPr>
+          <w:rtl w:val="0"/>
+        </w:rPr>
+        <w:t xml:space="preserve">Gautam:</w:t>
+      </w:r>
+    </w:p>
+    <w:p>
+      <w:pPr>
+        <w:numPr>
+          <w:ilvl w:val="2"/>
+          <w:numId w:val="1"/>
+        </w:numPr>
+        <w:ind w:left="2160" w:hanging="360"/>
+      </w:pPr>
+      <w:r>
+        <w:rPr>
+          <w:rtl w:val="0"/>
+        </w:rPr>
+        <w:t xml:space="preserve">Connect local to Piazza api</w:t>
+      </w:r>
+    </w:p>
+    <w:p>
+      <w:pPr>
+        <w:numPr>
+          <w:ilvl w:val="2"/>
+          <w:numId w:val="1"/>
+        </w:numPr>
+        <w:ind w:left="2160" w:hanging="360"/>
+        <w:rPr>
+          <w:u w:val="none"/>
+        </w:rPr>
+      </w:pPr>
+      <w:r>
+        <w:rPr>
+          <w:rtl w:val="0"/>
+        </w:rPr>
+        <w:t xml:space="preserve">UX - Wireframe/paper-prototype - connect with Nidhi</w:t>
+      </w:r>
+    </w:p>
+    <w:p>
+      <w:pPr>
+        <w:numPr>
+          <w:ilvl w:val="1"/>
+          <w:numId w:val="1"/>
+        </w:numPr>
+        <w:ind w:left="1440" w:hanging="360"/>
+      </w:pPr>
+      <w:r>
+        <w:rPr>
+          <w:rtl w:val="0"/>
+        </w:rPr>
+        <w:t xml:space="preserve">Hyun Soo Kim (Harriet): </w:t>
+      </w:r>
+    </w:p>
+    <w:p>
+      <w:pPr>
+        <w:numPr>
+          <w:ilvl w:val="2"/>
+          <w:numId w:val="1"/>
+        </w:numPr>
+        <w:ind w:left="2160" w:hanging="360"/>
+      </w:pPr>
+      <w:r>
+        <w:rPr>
+          <w:rtl w:val="0"/>
+        </w:rPr>
+        <w:t xml:space="preserve">Connect local to Piazza api - connect with Aanya/Gautam</w:t>
+      </w:r>
+    </w:p>
+    <w:p>
+      <w:pPr>
+        <w:numPr>
+          <w:ilvl w:val="0"/>
+          <w:numId w:val="1"/>
+        </w:numPr>
+        <w:ind w:left="720" w:hanging="360"/>
+      </w:pPr>
+      <w:r>
+        <w:rPr>
+          <w:rtl w:val="0"/>
+        </w:rPr>
+        <w:t xml:space="preserve">Education Research:</w:t>
+      </w:r>
+    </w:p>
+    <w:p>
+      <w:pPr>
+        <w:numPr>
+          <w:ilvl w:val="1"/>
+          <w:numId w:val="1"/>
+        </w:numPr>
+        <w:ind w:left="1440" w:hanging="360"/>
+      </w:pPr>
+      <w:r>
+        <w:rPr>
+          <w:rtl w:val="0"/>
+        </w:rPr>
+        <w:t xml:space="preserve">Daniel:</w:t>
+      </w:r>
+    </w:p>
+    <w:p>
+      <w:pPr>
+        <w:numPr>
+          <w:ilvl w:val="2"/>
+          <w:numId w:val="1"/>
+        </w:numPr>
+        <w:ind w:left="2160" w:hanging="360"/>
+      </w:pPr>
+      <w:r>
+        <w:rPr>
+          <w:rtl w:val="0"/>
+        </w:rPr>
+        <w:t xml:space="preserve">Giving the presentation on Metacognition</w:t>
       </w:r>
     </w:p>
     <w:p>

</xml_diff>